<commit_message>
style: update use case diagrams with icons and improve formatting in documentation
</commit_message>
<xml_diff>
--- a/TRƯỜNG ĐẠI HỌC.docx
+++ b/TRƯỜNG ĐẠI HỌC.docx
@@ -3586,6 +3586,7 @@
     <w:p>
       <w:pPr>
         <w:pStyle w:val="Heading3"/>
+        <w:jc w:val="center"/>
         <w:rPr>
           <w:lang w:val="vi-VN"/>
         </w:rPr>
@@ -3594,11 +3595,12 @@
         <w:rPr>
           <w:noProof/>
         </w:rPr>
+        <w:lastRenderedPageBreak/>
         <w:drawing>
-          <wp:inline distT="0" distB="0" distL="0" distR="0" wp14:anchorId="54165F1D" wp14:editId="2830B01B">
-            <wp:extent cx="5731492" cy="7935311"/>
-            <wp:effectExtent l="0" t="0" r="3175" b="8890"/>
-            <wp:docPr id="131989596" name="Picture 1"/>
+          <wp:inline distT="0" distB="0" distL="0" distR="0" wp14:anchorId="2C7A63A1" wp14:editId="65B4B59F">
+            <wp:extent cx="2851150" cy="8863330"/>
+            <wp:effectExtent l="0" t="0" r="6350" b="0"/>
+            <wp:docPr id="788215764" name="Picture 2"/>
             <wp:cNvGraphicFramePr>
               <a:graphicFrameLocks xmlns:a="http://schemas.openxmlformats.org/drawingml/2006/main" noChangeAspect="1"/>
             </wp:cNvGraphicFramePr>
@@ -3606,13 +3608,13 @@
               <a:graphicData uri="http://schemas.openxmlformats.org/drawingml/2006/picture">
                 <pic:pic xmlns:pic="http://schemas.openxmlformats.org/drawingml/2006/picture">
                   <pic:nvPicPr>
-                    <pic:cNvPr id="0" name="Picture 1"/>
+                    <pic:cNvPr id="0" name="Picture 6"/>
                     <pic:cNvPicPr>
                       <a:picLocks noChangeAspect="1" noChangeArrowheads="1"/>
                     </pic:cNvPicPr>
                   </pic:nvPicPr>
                   <pic:blipFill>
-                    <a:blip r:embed="rId6" cstate="print">
+                    <a:blip r:embed="rId6">
                       <a:extLst>
                         <a:ext uri="{28A0092B-C50C-407E-A947-70E740481C1C}">
                           <a14:useLocalDpi xmlns:a14="http://schemas.microsoft.com/office/drawing/2010/main" val="0"/>
@@ -3627,7 +3629,7 @@
                   <pic:spPr bwMode="auto">
                     <a:xfrm>
                       <a:off x="0" y="0"/>
-                      <a:ext cx="5750200" cy="7961212"/>
+                      <a:ext cx="2851150" cy="8863330"/>
                     </a:xfrm>
                     <a:prstGeom prst="rect">
                       <a:avLst/>
@@ -9999,10 +10001,10 @@
         </w:rPr>
         <w:lastRenderedPageBreak/>
         <w:drawing>
-          <wp:inline distT="0" distB="0" distL="0" distR="0" wp14:anchorId="52DF4A2E" wp14:editId="5B2DB77A">
-            <wp:extent cx="5731510" cy="2825750"/>
+          <wp:inline distT="0" distB="0" distL="0" distR="0" wp14:anchorId="342A137B" wp14:editId="47F405D1">
+            <wp:extent cx="5731510" cy="2134870"/>
             <wp:effectExtent l="0" t="0" r="2540" b="0"/>
-            <wp:docPr id="684695654" name="Picture 17"/>
+            <wp:docPr id="226486628" name="Picture 3"/>
             <wp:cNvGraphicFramePr>
               <a:graphicFrameLocks xmlns:a="http://schemas.openxmlformats.org/drawingml/2006/main" noChangeAspect="1"/>
             </wp:cNvGraphicFramePr>
@@ -10010,7 +10012,7 @@
               <a:graphicData uri="http://schemas.openxmlformats.org/drawingml/2006/picture">
                 <pic:pic xmlns:pic="http://schemas.openxmlformats.org/drawingml/2006/picture">
                   <pic:nvPicPr>
-                    <pic:cNvPr id="684695654" name="Picture 17"/>
+                    <pic:cNvPr id="0" name="Picture 8"/>
                     <pic:cNvPicPr>
                       <a:picLocks noChangeAspect="1" noChangeArrowheads="1"/>
                     </pic:cNvPicPr>
@@ -10028,10 +10030,10 @@
                       <a:fillRect/>
                     </a:stretch>
                   </pic:blipFill>
-                  <pic:spPr>
+                  <pic:spPr bwMode="auto">
                     <a:xfrm>
                       <a:off x="0" y="0"/>
-                      <a:ext cx="5731510" cy="2825750"/>
+                      <a:ext cx="5731510" cy="2134870"/>
                     </a:xfrm>
                     <a:prstGeom prst="rect">
                       <a:avLst/>

</xml_diff>